<commit_message>
fix mistakes in reports
</commit_message>
<xml_diff>
--- a/Lab1/report/Лаб1_ІМ-о51_Мосендз.docx
+++ b/Lab1/report/Лаб1_ІМ-о51_Мосендз.docx
@@ -495,7 +495,26 @@
         <w:tab/>
         <w:tab/>
         <w:tab/>
-        <w:t xml:space="preserve">Порєв В.М. </w:t>
+      </w:r>
+      <w:r>
+        <w:rPr>
+          <w:rFonts w:ascii="Times New Roman" w:cs="Times New Roman" w:eastAsia="Times New Roman" w:hAnsi="Times New Roman"/>
+          <w:sz w:val="28"/>
+          <w:szCs w:val="28"/>
+          <w:rtl w:val="0"/>
+        </w:rPr>
+        <w:t xml:space="preserve">Рекечинський Д. О.</w:t>
+      </w:r>
+      <w:r>
+        <w:rPr>
+          <w:rFonts w:ascii="Times New Roman" w:cs="Times New Roman" w:eastAsia="Times New Roman" w:hAnsi="Times New Roman"/>
+          <w:color w:val="000000"/>
+          <w:sz w:val="28"/>
+          <w:szCs w:val="28"/>
+          <w:shd w:fill="auto" w:val="clear"/>
+          <w:rtl w:val="0"/>
+        </w:rPr>
+        <w:t xml:space="preserve"> </w:t>
         <w:br w:type="textWrapping"/>
       </w:r>
       <w:r>
@@ -19582,12 +19601,12 @@
           <wp:inline distB="114300" distT="114300" distL="114300" distR="114300">
             <wp:extent cx="3957638" cy="2486208"/>
             <wp:effectExtent b="0" l="0" r="0" t="0"/>
-            <wp:docPr id="5" name="image4.png"/>
+            <wp:docPr id="5" name="image1.png"/>
             <a:graphic>
               <a:graphicData uri="http://schemas.openxmlformats.org/drawingml/2006/picture">
                 <pic:pic>
                   <pic:nvPicPr>
-                    <pic:cNvPr id="0" name="image4.png"/>
+                    <pic:cNvPr id="0" name="image1.png"/>
                     <pic:cNvPicPr preferRelativeResize="0"/>
                   </pic:nvPicPr>
                   <pic:blipFill>
@@ -19691,12 +19710,12 @@
             <wp:extent cx="4005263" cy="2611747"/>
             <wp:effectExtent b="0" l="0" r="0" t="0"/>
             <wp:wrapSquare wrapText="bothSides" distB="114300" distT="114300" distL="114300" distR="114300"/>
-            <wp:docPr id="6" name="image2.png"/>
+            <wp:docPr id="6" name="image3.png"/>
             <a:graphic>
               <a:graphicData uri="http://schemas.openxmlformats.org/drawingml/2006/picture">
                 <pic:pic>
                   <pic:nvPicPr>
-                    <pic:cNvPr id="0" name="image2.png"/>
+                    <pic:cNvPr id="0" name="image3.png"/>
                     <pic:cNvPicPr preferRelativeResize="0"/>
                   </pic:nvPicPr>
                   <pic:blipFill>
@@ -19784,12 +19803,12 @@
           <wp:inline distB="114300" distT="114300" distL="114300" distR="114300">
             <wp:extent cx="4608447" cy="2799810"/>
             <wp:effectExtent b="0" l="0" r="0" t="0"/>
-            <wp:docPr id="1" name="image1.png"/>
+            <wp:docPr id="1" name="image2.png"/>
             <a:graphic>
               <a:graphicData uri="http://schemas.openxmlformats.org/drawingml/2006/picture">
                 <pic:pic>
                   <pic:nvPicPr>
-                    <pic:cNvPr id="0" name="image1.png"/>
+                    <pic:cNvPr id="0" name="image2.png"/>
                     <pic:cNvPicPr preferRelativeResize="0"/>
                   </pic:nvPicPr>
                   <pic:blipFill>
@@ -19849,12 +19868,12 @@
             <wp:extent cx="4071063" cy="2557463"/>
             <wp:effectExtent b="0" l="0" r="0" t="0"/>
             <wp:wrapSquare wrapText="bothSides" distB="114300" distT="114300" distL="114300" distR="114300"/>
-            <wp:docPr id="4" name="image3.png"/>
+            <wp:docPr id="4" name="image4.png"/>
             <a:graphic>
               <a:graphicData uri="http://schemas.openxmlformats.org/drawingml/2006/picture">
                 <pic:pic>
                   <pic:nvPicPr>
-                    <pic:cNvPr id="0" name="image3.png"/>
+                    <pic:cNvPr id="0" name="image4.png"/>
                     <pic:cNvPicPr preferRelativeResize="0"/>
                   </pic:nvPicPr>
                   <pic:blipFill>

</xml_diff>